<commit_message>
Replace EN Confidentiality and IP Rights Assignment Agreement template with updated version
</commit_message>
<xml_diff>
--- a/backend/templates-src/confidentiality-ip-assignment.docx
+++ b/backend/templates-src/confidentiality-ip-assignment.docx
@@ -1,6 +1,6 @@
 
 <file path=word/document.xml><?xml version="1.0" encoding="utf-8"?>
-<w:document xmlns:wpc="http://schemas.microsoft.com/office/word/2010/wordprocessingCanvas" xmlns:cx="http://schemas.microsoft.com/office/drawing/2014/chartex" xmlns:cx1="http://schemas.microsoft.com/office/drawing/2015/9/8/chartex" xmlns:cx2="http://schemas.microsoft.com/office/drawing/2015/10/21/chartex" xmlns:cx3="http://schemas.microsoft.com/office/drawing/2016/5/9/chartex" xmlns:cx4="http://schemas.microsoft.com/office/drawing/2016/5/10/chartex" xmlns:cx5="http://schemas.microsoft.com/office/drawing/2016/5/11/chartex" xmlns:cx6="http://schemas.microsoft.com/office/drawing/2016/5/12/chartex" xmlns:cx7="http://schemas.microsoft.com/office/drawing/2016/5/13/chartex" xmlns:cx8="http://schemas.microsoft.com/office/drawing/2016/5/14/chartex" xmlns:mc="http://schemas.openxmlformats.org/markup-compatibility/2006" xmlns:aink="http://schemas.microsoft.com/office/drawing/2016/ink" xmlns:am3d="http://schemas.microsoft.com/office/drawing/2017/model3d" xmlns:o="urn:schemas-microsoft-com:office:office" xmlns:oel="http://schemas.microsoft.com/office/2019/extlst" xmlns:r="http://schemas.openxmlformats.org/officeDocument/2006/relationships" xmlns:m="http://schemas.openxmlformats.org/officeDocument/2006/math" xmlns:v="urn:schemas-microsoft-com:vml" xmlns:wp14="http://schemas.microsoft.com/office/word/2010/wordprocessingDrawing" xmlns:wp="http://schemas.openxmlformats.org/drawingml/2006/wordprocessingDrawing" xmlns:w10="urn:schemas-microsoft-com:office:word" xmlns:w="http://schemas.openxmlformats.org/wordprocessingml/2006/main" xmlns:w14="http://schemas.microsoft.com/office/word/2010/wordml" xmlns:w15="http://schemas.microsoft.com/office/word/2012/wordml" xmlns:w16cex="http://schemas.microsoft.com/office/word/2018/wordml/cex" xmlns:w16cid="http://schemas.microsoft.com/office/word/2016/wordml/cid" xmlns:w16="http://schemas.microsoft.com/office/word/2018/wordml" xmlns:w16du="http://schemas.microsoft.com/office/word/2023/wordml/word16du" xmlns:w16sdtdh="http://schemas.microsoft.com/office/word/2020/wordml/sdtdatahash" xmlns:w16sdtfl="http://schemas.microsoft.com/office/word/2024/wordml/sdtformatlock" xmlns:w16se="http://schemas.microsoft.com/office/word/2015/wordml/symex" xmlns:wpg="http://schemas.microsoft.com/office/word/2010/wordprocessingGroup" xmlns:wpi="http://schemas.microsoft.com/office/word/2010/wordprocessingInk" xmlns:wne="http://schemas.microsoft.com/office/word/2006/wordml" xmlns:wps="http://schemas.microsoft.com/office/word/2010/wordprocessingShape" mc:Ignorable="w14 w15 w16se w16cid w16 w16cex w16sdtdh w16sdtfl w16du wp14">
+<w:document xmlns:wpc="http://schemas.microsoft.com/office/word/2010/wordprocessingCanvas" xmlns:cx="http://schemas.microsoft.com/office/drawing/2014/chartex" xmlns:cx1="http://schemas.microsoft.com/office/drawing/2015/9/8/chartex" xmlns:cx2="http://schemas.microsoft.com/office/drawing/2015/10/21/chartex" xmlns:cx3="http://schemas.microsoft.com/office/drawing/2016/5/9/chartex" xmlns:cx4="http://schemas.microsoft.com/office/drawing/2016/5/10/chartex" xmlns:cx5="http://schemas.microsoft.com/office/drawing/2016/5/11/chartex" xmlns:cx6="http://schemas.microsoft.com/office/drawing/2016/5/12/chartex" xmlns:cx7="http://schemas.microsoft.com/office/drawing/2016/5/13/chartex" xmlns:cx8="http://schemas.microsoft.com/office/drawing/2016/5/14/chartex" xmlns:mc="http://schemas.openxmlformats.org/markup-compatibility/2006" xmlns:aink="http://schemas.microsoft.com/office/drawing/2016/ink" xmlns:am3d="http://schemas.microsoft.com/office/drawing/2017/model3d" xmlns:o="urn:schemas-microsoft-com:office:office" xmlns:oel="http://schemas.microsoft.com/office/2019/extlst" xmlns:r="http://schemas.openxmlformats.org/officeDocument/2006/relationships" xmlns:m="http://schemas.openxmlformats.org/officeDocument/2006/math" xmlns:v="urn:schemas-microsoft-com:vml" xmlns:wp14="http://schemas.microsoft.com/office/word/2010/wordprocessingDrawing" xmlns:wp="http://schemas.openxmlformats.org/drawingml/2006/wordprocessingDrawing" xmlns:w10="urn:schemas-microsoft-com:office:word" xmlns:w="http://schemas.openxmlformats.org/wordprocessingml/2006/main" xmlns:w14="http://schemas.microsoft.com/office/word/2010/wordml" xmlns:w15="http://schemas.microsoft.com/office/word/2012/wordml" xmlns:w16cei="http://schemas.microsoft.com/office/word/2026/wordml/cei" xmlns:w16cex="http://schemas.microsoft.com/office/word/2018/wordml/cex" xmlns:w16cid="http://schemas.microsoft.com/office/word/2016/wordml/cid" xmlns:w16="http://schemas.microsoft.com/office/word/2018/wordml" xmlns:w16du="http://schemas.microsoft.com/office/word/2023/wordml/word16du" xmlns:w16sdtdh="http://schemas.microsoft.com/office/word/2020/wordml/sdtdatahash" xmlns:w16sdtfl="http://schemas.microsoft.com/office/word/2024/wordml/sdtformatlock" xmlns:w16se="http://schemas.microsoft.com/office/word/2015/wordml/symex" xmlns:wpg="http://schemas.microsoft.com/office/word/2010/wordprocessingGroup" xmlns:wpi="http://schemas.microsoft.com/office/word/2010/wordprocessingInk" xmlns:wne="http://schemas.microsoft.com/office/word/2006/wordml" xmlns:wps="http://schemas.microsoft.com/office/word/2010/wordprocessingShape" mc:Ignorable="w14 w15 w16se w16cid w16 w16cex w16sdtdh w16sdtfl w16du wp14">
   <w:body>
     <w:p>
       <w:pPr>
@@ -2698,7 +2698,7 @@
           <w:szCs w:val="22"/>
           <w:lang w:val="en-US"/>
         </w:rPr>
-        <w:t xml:space="preserve"> fees, and all other costs and expenses, in connection with any claim (including, but not limited to claims by any governmental agencies) arising from or in connection with: (i) any breach of applicable law, rules or regulations by the </w:t>
+        <w:t xml:space="preserve"> fees, and all other costs and expenses, in connection with any claim (including, but not limited to claims by any governmental agencies) arising from or in connection with</w:t>
       </w:r>
       <w:r>
         <w:rPr>
@@ -2707,6 +2707,24 @@
           <w:szCs w:val="22"/>
           <w:lang w:val="en-US"/>
         </w:rPr>
+        <w:t xml:space="preserve"> </w:t>
+      </w:r>
+      <w:r>
+        <w:rPr>
+          <w:rFonts w:ascii="Book Antiqua" w:hAnsi="Book Antiqua"/>
+          <w:sz w:val="22"/>
+          <w:szCs w:val="22"/>
+          <w:lang w:val="en-US"/>
+        </w:rPr>
+        <w:t xml:space="preserve">any actual or alleged intellectual property infringement or misappropriation by the </w:t>
+      </w:r>
+      <w:r>
+        <w:rPr>
+          <w:rFonts w:ascii="Book Antiqua" w:hAnsi="Book Antiqua"/>
+          <w:sz w:val="22"/>
+          <w:szCs w:val="22"/>
+          <w:lang w:val="en-US"/>
+        </w:rPr>
         <w:t>Principal</w:t>
       </w:r>
       <w:r>
@@ -2726,141 +2744,6 @@
           <w:lang w:val="en-US"/>
         </w:rPr>
         <w:t>Engagement</w:t>
-      </w:r>
-      <w:r>
-        <w:rPr>
-          <w:rFonts w:ascii="Book Antiqua" w:hAnsi="Book Antiqua"/>
-          <w:sz w:val="22"/>
-          <w:szCs w:val="22"/>
-          <w:lang w:val="en-US"/>
-        </w:rPr>
-        <w:t xml:space="preserve">; (ii) any actual or alleged intellectual property infringement or misappropriation by the </w:t>
-      </w:r>
-      <w:r>
-        <w:rPr>
-          <w:rFonts w:ascii="Book Antiqua" w:hAnsi="Book Antiqua"/>
-          <w:sz w:val="22"/>
-          <w:szCs w:val="22"/>
-          <w:lang w:val="en-US"/>
-        </w:rPr>
-        <w:t>Principal</w:t>
-      </w:r>
-      <w:r>
-        <w:rPr>
-          <w:rFonts w:ascii="Book Antiqua" w:hAnsi="Book Antiqua"/>
-          <w:sz w:val="22"/>
-          <w:szCs w:val="22"/>
-          <w:lang w:val="en-US"/>
-        </w:rPr>
-        <w:t xml:space="preserve"> in the provision of the </w:t>
-      </w:r>
-      <w:r>
-        <w:rPr>
-          <w:rFonts w:ascii="Book Antiqua" w:hAnsi="Book Antiqua"/>
-          <w:sz w:val="22"/>
-          <w:szCs w:val="22"/>
-          <w:lang w:val="en-US"/>
-        </w:rPr>
-        <w:t>Engagement</w:t>
-      </w:r>
-      <w:r>
-        <w:rPr>
-          <w:rFonts w:ascii="Book Antiqua" w:hAnsi="Book Antiqua"/>
-          <w:sz w:val="22"/>
-          <w:szCs w:val="22"/>
-          <w:lang w:val="en-US"/>
-        </w:rPr>
-        <w:t xml:space="preserve">; (iii) any breach by the </w:t>
-      </w:r>
-      <w:r>
-        <w:rPr>
-          <w:rFonts w:ascii="Book Antiqua" w:hAnsi="Book Antiqua"/>
-          <w:sz w:val="22"/>
-          <w:szCs w:val="22"/>
-          <w:lang w:val="en-US"/>
-        </w:rPr>
-        <w:t>Principal</w:t>
-      </w:r>
-      <w:r>
-        <w:rPr>
-          <w:rFonts w:ascii="Book Antiqua" w:hAnsi="Book Antiqua"/>
-          <w:sz w:val="22"/>
-          <w:szCs w:val="22"/>
-          <w:lang w:val="en-US"/>
-        </w:rPr>
-        <w:t xml:space="preserve"> of any of the provisions of this Agreement; (iv) any injuries or death or other employment or work-related claims suffered by any </w:t>
-      </w:r>
-      <w:r>
-        <w:rPr>
-          <w:rFonts w:ascii="Book Antiqua" w:hAnsi="Book Antiqua"/>
-          <w:sz w:val="22"/>
-          <w:szCs w:val="22"/>
-          <w:lang w:val="en-US"/>
-        </w:rPr>
-        <w:t>Corporation</w:t>
-      </w:r>
-      <w:r>
-        <w:rPr>
-          <w:rFonts w:ascii="Book Antiqua" w:hAnsi="Book Antiqua"/>
-          <w:sz w:val="22"/>
-          <w:szCs w:val="22"/>
-          <w:lang w:val="en-US"/>
-        </w:rPr>
-        <w:t xml:space="preserve"> Indemnified Parties or any third party personnel caused by the negligence or willful misconduct of the </w:t>
-      </w:r>
-      <w:r>
-        <w:rPr>
-          <w:rFonts w:ascii="Book Antiqua" w:hAnsi="Book Antiqua"/>
-          <w:sz w:val="22"/>
-          <w:szCs w:val="22"/>
-          <w:lang w:val="en-US"/>
-        </w:rPr>
-        <w:t>Principal</w:t>
-      </w:r>
-      <w:r>
-        <w:rPr>
-          <w:rFonts w:ascii="Book Antiqua" w:hAnsi="Book Antiqua"/>
-          <w:sz w:val="22"/>
-          <w:szCs w:val="22"/>
-          <w:lang w:val="en-US"/>
-        </w:rPr>
-        <w:t xml:space="preserve">; or (v) any damage or loss to </w:t>
-      </w:r>
-      <w:r>
-        <w:rPr>
-          <w:rFonts w:ascii="Book Antiqua" w:hAnsi="Book Antiqua"/>
-          <w:sz w:val="22"/>
-          <w:szCs w:val="22"/>
-          <w:lang w:val="en-US"/>
-        </w:rPr>
-        <w:t>Corporation</w:t>
-      </w:r>
-      <w:r>
-        <w:rPr>
-          <w:rFonts w:ascii="Book Antiqua" w:hAnsi="Book Antiqua"/>
-          <w:sz w:val="22"/>
-          <w:szCs w:val="22"/>
-          <w:lang w:val="en-US"/>
-        </w:rPr>
-        <w:t>’s</w:t>
-      </w:r>
-      <w:r>
-        <w:rPr>
-          <w:rFonts w:ascii="Book Antiqua" w:hAnsi="Book Antiqua"/>
-          <w:sz w:val="22"/>
-          <w:szCs w:val="22"/>
-          <w:lang w:val="en-US"/>
-        </w:rPr>
-        <w:t xml:space="preserve"> or any third party’s facilities, equipment or other property caused by the negligence or willful misconduct of the </w:t>
-      </w:r>
-      <w:r>
-        <w:rPr>
-          <w:rFonts w:ascii="Book Antiqua" w:hAnsi="Book Antiqua"/>
-          <w:sz w:val="22"/>
-          <w:szCs w:val="22"/>
-          <w:lang w:val="en-US"/>
-        </w:rPr>
-        <w:t>Principal</w:t>
       </w:r>
       <w:r>
         <w:rPr>
@@ -3206,7 +3089,39 @@
           <w:sz w:val="22"/>
           <w:szCs w:val="22"/>
         </w:rPr>
-        <w:t>This Agreement constitutes the entire agreement between the Parties and supersedes and replaces any and all other representations, understandings, negotiations and previous agreements, written or oral, express or implied.</w:t>
+        <w:t>This Agreement constitutes the entire agreement between the Parties and supersedes and replaces any and all other representations, understandings, negotiations and previous agreements, written or oral, express or implied</w:t>
+      </w:r>
+      <w:r>
+        <w:rPr>
+          <w:rFonts w:ascii="Book Antiqua" w:hAnsi="Book Antiqua"/>
+          <w:sz w:val="22"/>
+          <w:szCs w:val="22"/>
+        </w:rPr>
+        <w:t xml:space="preserve">, including any employment </w:t>
+      </w:r>
+      <w:r>
+        <w:rPr>
+          <w:rFonts w:ascii="Book Antiqua" w:hAnsi="Book Antiqua"/>
+          <w:sz w:val="22"/>
+          <w:szCs w:val="22"/>
+        </w:rPr>
+        <w:t xml:space="preserve">or confidentiality </w:t>
+      </w:r>
+      <w:r>
+        <w:rPr>
+          <w:rFonts w:ascii="Book Antiqua" w:hAnsi="Book Antiqua"/>
+          <w:sz w:val="22"/>
+          <w:szCs w:val="22"/>
+        </w:rPr>
+        <w:t>agreement</w:t>
+      </w:r>
+      <w:r>
+        <w:rPr>
+          <w:rFonts w:ascii="Book Antiqua" w:hAnsi="Book Antiqua"/>
+          <w:sz w:val="22"/>
+          <w:szCs w:val="22"/>
+        </w:rPr>
+        <w:t>.</w:t>
       </w:r>
     </w:p>
     <w:p>
@@ -3229,23 +3144,79 @@
           <w:sz w:val="22"/>
           <w:szCs w:val="22"/>
         </w:rPr>
-        <w:t xml:space="preserve">Any notice required or permitted to be given to a Party under this Agreement shall be deemed to have been received (i) if delivered by email or </w:t>
-      </w:r>
-      <w:r>
-        <w:rPr>
-          <w:rFonts w:ascii="Book Antiqua" w:hAnsi="Book Antiqua"/>
-          <w:sz w:val="22"/>
-          <w:szCs w:val="22"/>
-        </w:rPr>
-        <w:t>any</w:t>
-      </w:r>
-      <w:r>
-        <w:rPr>
-          <w:rFonts w:ascii="Book Antiqua" w:hAnsi="Book Antiqua"/>
-          <w:sz w:val="22"/>
-          <w:szCs w:val="22"/>
-        </w:rPr>
-        <w:t xml:space="preserve"> form of electronic communication to such Party’s email address last known to the other Party, or (ii) if mailed to such Party’s business address last known to the other Party.</w:t>
+        <w:t xml:space="preserve">This Agreement is a contract made under and shall be governed by and construed in accordance with the laws of the Province of </w:t>
+      </w:r>
+      <w:r>
+        <w:rPr>
+          <w:rFonts w:ascii="Book Antiqua" w:hAnsi="Book Antiqua"/>
+          <w:sz w:val="22"/>
+          <w:szCs w:val="22"/>
+        </w:rPr>
+        <w:t>Quebec</w:t>
+      </w:r>
+      <w:r>
+        <w:rPr>
+          <w:rFonts w:ascii="Book Antiqua" w:hAnsi="Book Antiqua"/>
+          <w:sz w:val="22"/>
+          <w:szCs w:val="22"/>
+        </w:rPr>
+        <w:t xml:space="preserve"> and the federal laws of Canada applicable in the Province of </w:t>
+      </w:r>
+      <w:r>
+        <w:rPr>
+          <w:rFonts w:ascii="Book Antiqua" w:hAnsi="Book Antiqua"/>
+          <w:sz w:val="22"/>
+          <w:szCs w:val="22"/>
+        </w:rPr>
+        <w:t>Quebec</w:t>
+      </w:r>
+      <w:r>
+        <w:rPr>
+          <w:rFonts w:ascii="Book Antiqua" w:hAnsi="Book Antiqua"/>
+          <w:sz w:val="22"/>
+          <w:szCs w:val="22"/>
+        </w:rPr>
+        <w:t xml:space="preserve">. Each of the Parties hereto expressly submits and consents to the exclusive jurisdiction of the courts of the Province of </w:t>
+      </w:r>
+      <w:r>
+        <w:rPr>
+          <w:rFonts w:ascii="Book Antiqua" w:hAnsi="Book Antiqua"/>
+          <w:sz w:val="22"/>
+          <w:szCs w:val="22"/>
+        </w:rPr>
+        <w:t>Qu</w:t>
+      </w:r>
+      <w:r>
+        <w:rPr>
+          <w:rFonts w:ascii="Book Antiqua" w:hAnsi="Book Antiqua"/>
+          <w:sz w:val="22"/>
+          <w:szCs w:val="22"/>
+        </w:rPr>
+        <w:t>é</w:t>
+      </w:r>
+      <w:r>
+        <w:rPr>
+          <w:rFonts w:ascii="Book Antiqua" w:hAnsi="Book Antiqua"/>
+          <w:sz w:val="22"/>
+          <w:szCs w:val="22"/>
+        </w:rPr>
+        <w:t>bec</w:t>
+      </w:r>
+      <w:r>
+        <w:rPr>
+          <w:rFonts w:ascii="Book Antiqua" w:hAnsi="Book Antiqua"/>
+          <w:sz w:val="22"/>
+          <w:szCs w:val="22"/>
+        </w:rPr>
+        <w:t xml:space="preserve"> </w:t>
+      </w:r>
+      <w:r>
+        <w:rPr>
+          <w:rFonts w:ascii="Book Antiqua" w:hAnsi="Book Antiqua"/>
+          <w:sz w:val="22"/>
+          <w:szCs w:val="22"/>
+        </w:rPr>
+        <w:t>with respect to any controversy arising out of or relating to this Agreement or any supplement hereto or to any transactions in connection therewith.</w:t>
       </w:r>
     </w:p>
     <w:p>
@@ -3268,79 +3239,7 @@
           <w:sz w:val="22"/>
           <w:szCs w:val="22"/>
         </w:rPr>
-        <w:t xml:space="preserve">This Agreement is a contract made under and shall be governed by and construed in accordance with the laws of the Province of </w:t>
-      </w:r>
-      <w:r>
-        <w:rPr>
-          <w:rFonts w:ascii="Book Antiqua" w:hAnsi="Book Antiqua"/>
-          <w:sz w:val="22"/>
-          <w:szCs w:val="22"/>
-        </w:rPr>
-        <w:t>Quebec</w:t>
-      </w:r>
-      <w:r>
-        <w:rPr>
-          <w:rFonts w:ascii="Book Antiqua" w:hAnsi="Book Antiqua"/>
-          <w:sz w:val="22"/>
-          <w:szCs w:val="22"/>
-        </w:rPr>
-        <w:t xml:space="preserve"> and the federal laws of Canada applicable in the Province of </w:t>
-      </w:r>
-      <w:r>
-        <w:rPr>
-          <w:rFonts w:ascii="Book Antiqua" w:hAnsi="Book Antiqua"/>
-          <w:sz w:val="22"/>
-          <w:szCs w:val="22"/>
-        </w:rPr>
-        <w:t>Quebec</w:t>
-      </w:r>
-      <w:r>
-        <w:rPr>
-          <w:rFonts w:ascii="Book Antiqua" w:hAnsi="Book Antiqua"/>
-          <w:sz w:val="22"/>
-          <w:szCs w:val="22"/>
-        </w:rPr>
-        <w:t xml:space="preserve">. Each of the Parties hereto expressly submits and consents to the exclusive jurisdiction of the courts of the Province of </w:t>
-      </w:r>
-      <w:r>
-        <w:rPr>
-          <w:rFonts w:ascii="Book Antiqua" w:hAnsi="Book Antiqua"/>
-          <w:sz w:val="22"/>
-          <w:szCs w:val="22"/>
-        </w:rPr>
-        <w:t>Qu</w:t>
-      </w:r>
-      <w:r>
-        <w:rPr>
-          <w:rFonts w:ascii="Book Antiqua" w:hAnsi="Book Antiqua"/>
-          <w:sz w:val="22"/>
-          <w:szCs w:val="22"/>
-        </w:rPr>
-        <w:t>é</w:t>
-      </w:r>
-      <w:r>
-        <w:rPr>
-          <w:rFonts w:ascii="Book Antiqua" w:hAnsi="Book Antiqua"/>
-          <w:sz w:val="22"/>
-          <w:szCs w:val="22"/>
-        </w:rPr>
-        <w:t>bec</w:t>
-      </w:r>
-      <w:r>
-        <w:rPr>
-          <w:rFonts w:ascii="Book Antiqua" w:hAnsi="Book Antiqua"/>
-          <w:sz w:val="22"/>
-          <w:szCs w:val="22"/>
-        </w:rPr>
-        <w:t xml:space="preserve"> </w:t>
-      </w:r>
-      <w:r>
-        <w:rPr>
-          <w:rFonts w:ascii="Book Antiqua" w:hAnsi="Book Antiqua"/>
-          <w:sz w:val="22"/>
-          <w:szCs w:val="22"/>
-        </w:rPr>
-        <w:t>with respect to any controversy arising out of or relating to this Agreement or any supplement hereto or to any transactions in connection therewith.</w:t>
+        <w:t>In the event that any covenant, provision or restriction contained in this Agreement is found to be void or unenforceable (in whole or in part) by a court of competent jurisdiction, it shall not affect or impair the validity of any other covenant, provisions or restrictions contained herein, nor shall it affect the validity or enforceability of such covenants, provisions or restrictions in any other jurisdiction or in regard to other circumstances. Any covenants, provisions or restrictions found to be void or unenforceable are declared to be separate and distinct, and the remaining covenants, provisions and restrictions shall remain in full force and effect.</w:t>
       </w:r>
     </w:p>
     <w:p>
@@ -3364,7 +3263,25 @@
           <w:szCs w:val="22"/>
         </w:rPr>
         <w:lastRenderedPageBreak/>
-        <w:t>In the event that any covenant, provision or restriction contained in this Agreement is found to be void or unenforceable (in whole or in part) by a court of competent jurisdiction, it shall not affect or impair the validity of any other covenant, provisions or restrictions contained herein, nor shall it affect the validity or enforceability of such covenants, provisions or restrictions in any other jurisdiction or in regard to other circumstances. Any covenants, provisions or restrictions found to be void or unenforceable are declared to be separate and distinct, and the remaining covenants, provisions and restrictions shall remain in full force and effect.</w:t>
+        <w:t xml:space="preserve">This Agreement </w:t>
+      </w:r>
+      <w:proofErr w:type="spellStart"/>
+      <w:r>
+        <w:rPr>
+          <w:rFonts w:ascii="Book Antiqua" w:hAnsi="Book Antiqua"/>
+          <w:sz w:val="22"/>
+          <w:szCs w:val="22"/>
+        </w:rPr>
+        <w:t>enures</w:t>
+      </w:r>
+      <w:proofErr w:type="spellEnd"/>
+      <w:r>
+        <w:rPr>
+          <w:rFonts w:ascii="Book Antiqua" w:hAnsi="Book Antiqua"/>
+          <w:sz w:val="22"/>
+          <w:szCs w:val="22"/>
+        </w:rPr>
+        <w:t xml:space="preserve"> to the benefit of and is binding upon the Parties and their respective successors (including by way of amalgamation) and permitted assigns.</w:t>
       </w:r>
     </w:p>
     <w:p>
@@ -3387,7 +3304,39 @@
           <w:sz w:val="22"/>
           <w:szCs w:val="22"/>
         </w:rPr>
-        <w:t>This Agreement enures to the benefit of and is binding upon the Parties and their respective successors (including by way of amalgamation) and permitted assigns.</w:t>
+        <w:t xml:space="preserve">No amendment, supplement, modification, waiver or termination of this Agreement and, unless otherwise specified, no consent or approval by any </w:t>
+      </w:r>
+      <w:r>
+        <w:rPr>
+          <w:rFonts w:ascii="Book Antiqua" w:hAnsi="Book Antiqua"/>
+          <w:sz w:val="22"/>
+          <w:szCs w:val="22"/>
+        </w:rPr>
+        <w:t>P</w:t>
+      </w:r>
+      <w:r>
+        <w:rPr>
+          <w:rFonts w:ascii="Book Antiqua" w:hAnsi="Book Antiqua"/>
+          <w:sz w:val="22"/>
+          <w:szCs w:val="22"/>
+        </w:rPr>
+        <w:t xml:space="preserve">arty, is binding unless executed in writing by the </w:t>
+      </w:r>
+      <w:r>
+        <w:rPr>
+          <w:rFonts w:ascii="Book Antiqua" w:hAnsi="Book Antiqua"/>
+          <w:sz w:val="22"/>
+          <w:szCs w:val="22"/>
+        </w:rPr>
+        <w:t>P</w:t>
+      </w:r>
+      <w:r>
+        <w:rPr>
+          <w:rFonts w:ascii="Book Antiqua" w:hAnsi="Book Antiqua"/>
+          <w:sz w:val="22"/>
+          <w:szCs w:val="22"/>
+        </w:rPr>
+        <w:t>arty to be bound.</w:t>
       </w:r>
     </w:p>
     <w:p>
@@ -3410,39 +3359,135 @@
           <w:sz w:val="22"/>
           <w:szCs w:val="22"/>
         </w:rPr>
-        <w:t xml:space="preserve">No amendment, supplement, modification, waiver or termination of this Agreement and, unless otherwise specified, no consent or approval by any </w:t>
-      </w:r>
-      <w:r>
-        <w:rPr>
-          <w:rFonts w:ascii="Book Antiqua" w:hAnsi="Book Antiqua"/>
-          <w:sz w:val="22"/>
-          <w:szCs w:val="22"/>
-        </w:rPr>
-        <w:t>P</w:t>
-      </w:r>
-      <w:r>
-        <w:rPr>
-          <w:rFonts w:ascii="Book Antiqua" w:hAnsi="Book Antiqua"/>
-          <w:sz w:val="22"/>
-          <w:szCs w:val="22"/>
-        </w:rPr>
-        <w:t xml:space="preserve">arty, is binding unless executed in writing by the </w:t>
-      </w:r>
-      <w:r>
-        <w:rPr>
-          <w:rFonts w:ascii="Book Antiqua" w:hAnsi="Book Antiqua"/>
-          <w:sz w:val="22"/>
-          <w:szCs w:val="22"/>
-        </w:rPr>
-        <w:t>P</w:t>
-      </w:r>
-      <w:r>
-        <w:rPr>
-          <w:rFonts w:ascii="Book Antiqua" w:hAnsi="Book Antiqua"/>
-          <w:sz w:val="22"/>
-          <w:szCs w:val="22"/>
-        </w:rPr>
-        <w:t>arty to be bound.</w:t>
+        <w:t xml:space="preserve">The </w:t>
+      </w:r>
+      <w:r>
+        <w:rPr>
+          <w:rFonts w:ascii="Book Antiqua" w:hAnsi="Book Antiqua"/>
+          <w:sz w:val="22"/>
+          <w:szCs w:val="22"/>
+        </w:rPr>
+        <w:t>Principal</w:t>
+      </w:r>
+      <w:r>
+        <w:rPr>
+          <w:rFonts w:ascii="Book Antiqua" w:hAnsi="Book Antiqua"/>
+          <w:sz w:val="22"/>
+          <w:szCs w:val="22"/>
+        </w:rPr>
+        <w:t xml:space="preserve"> may not assign any of the </w:t>
+      </w:r>
+      <w:r>
+        <w:rPr>
+          <w:rFonts w:ascii="Book Antiqua" w:hAnsi="Book Antiqua"/>
+          <w:sz w:val="22"/>
+          <w:szCs w:val="22"/>
+        </w:rPr>
+        <w:t>Principal</w:t>
+      </w:r>
+      <w:r>
+        <w:rPr>
+          <w:rFonts w:ascii="Book Antiqua" w:hAnsi="Book Antiqua"/>
+          <w:sz w:val="22"/>
+          <w:szCs w:val="22"/>
+        </w:rPr>
+        <w:t xml:space="preserve">’s rights or delegate any of the </w:t>
+      </w:r>
+      <w:r>
+        <w:rPr>
+          <w:rFonts w:ascii="Book Antiqua" w:hAnsi="Book Antiqua"/>
+          <w:sz w:val="22"/>
+          <w:szCs w:val="22"/>
+        </w:rPr>
+        <w:t>Principal</w:t>
+      </w:r>
+      <w:r>
+        <w:rPr>
+          <w:rFonts w:ascii="Book Antiqua" w:hAnsi="Book Antiqua"/>
+          <w:sz w:val="22"/>
+          <w:szCs w:val="22"/>
+        </w:rPr>
+        <w:t>’s duties or responsibilities under this Agreement</w:t>
+      </w:r>
+      <w:r>
+        <w:rPr>
+          <w:rFonts w:ascii="Book Antiqua" w:hAnsi="Book Antiqua"/>
+          <w:sz w:val="22"/>
+          <w:szCs w:val="22"/>
+        </w:rPr>
+        <w:t xml:space="preserve"> </w:t>
+      </w:r>
+      <w:r>
+        <w:rPr>
+          <w:rFonts w:ascii="Book Antiqua" w:hAnsi="Book Antiqua"/>
+          <w:sz w:val="22"/>
+          <w:szCs w:val="22"/>
+        </w:rPr>
+        <w:t xml:space="preserve">without </w:t>
+      </w:r>
+      <w:r>
+        <w:rPr>
+          <w:rFonts w:ascii="Book Antiqua" w:hAnsi="Book Antiqua"/>
+          <w:sz w:val="22"/>
+          <w:szCs w:val="22"/>
+        </w:rPr>
+        <w:t>Corporation</w:t>
+      </w:r>
+      <w:r>
+        <w:rPr>
+          <w:rFonts w:ascii="Book Antiqua" w:hAnsi="Book Antiqua"/>
+          <w:sz w:val="22"/>
+          <w:szCs w:val="22"/>
+        </w:rPr>
+        <w:t xml:space="preserve">’s prior written consent. </w:t>
+      </w:r>
+      <w:r>
+        <w:rPr>
+          <w:rFonts w:ascii="Book Antiqua" w:hAnsi="Book Antiqua"/>
+          <w:sz w:val="22"/>
+          <w:szCs w:val="22"/>
+        </w:rPr>
+        <w:t>Corporation</w:t>
+      </w:r>
+      <w:r>
+        <w:rPr>
+          <w:rFonts w:ascii="Book Antiqua" w:hAnsi="Book Antiqua"/>
+          <w:sz w:val="22"/>
+          <w:szCs w:val="22"/>
+        </w:rPr>
+        <w:t xml:space="preserve"> may, without the consent of the </w:t>
+      </w:r>
+      <w:r>
+        <w:rPr>
+          <w:rFonts w:ascii="Book Antiqua" w:hAnsi="Book Antiqua"/>
+          <w:sz w:val="22"/>
+          <w:szCs w:val="22"/>
+        </w:rPr>
+        <w:t>Principal</w:t>
+      </w:r>
+      <w:r>
+        <w:rPr>
+          <w:rFonts w:ascii="Book Antiqua" w:hAnsi="Book Antiqua"/>
+          <w:sz w:val="22"/>
+          <w:szCs w:val="22"/>
+        </w:rPr>
+        <w:t xml:space="preserve">, assign its rights, duties and obligations under this Agreement to an affiliate or to a purchaser of all, or substantially all of the assets of </w:t>
+      </w:r>
+      <w:r>
+        <w:rPr>
+          <w:rFonts w:ascii="Book Antiqua" w:hAnsi="Book Antiqua"/>
+          <w:sz w:val="22"/>
+          <w:szCs w:val="22"/>
+        </w:rPr>
+        <w:t>Corporation</w:t>
+      </w:r>
+      <w:r>
+        <w:rPr>
+          <w:rFonts w:ascii="Book Antiqua" w:hAnsi="Book Antiqua"/>
+          <w:sz w:val="22"/>
+          <w:szCs w:val="22"/>
+        </w:rPr>
+        <w:t>.</w:t>
       </w:r>
     </w:p>
     <w:p>
@@ -3465,135 +3510,7 @@
           <w:sz w:val="22"/>
           <w:szCs w:val="22"/>
         </w:rPr>
-        <w:t xml:space="preserve">The </w:t>
-      </w:r>
-      <w:r>
-        <w:rPr>
-          <w:rFonts w:ascii="Book Antiqua" w:hAnsi="Book Antiqua"/>
-          <w:sz w:val="22"/>
-          <w:szCs w:val="22"/>
-        </w:rPr>
-        <w:t>Principal</w:t>
-      </w:r>
-      <w:r>
-        <w:rPr>
-          <w:rFonts w:ascii="Book Antiqua" w:hAnsi="Book Antiqua"/>
-          <w:sz w:val="22"/>
-          <w:szCs w:val="22"/>
-        </w:rPr>
-        <w:t xml:space="preserve"> may not assign any of the </w:t>
-      </w:r>
-      <w:r>
-        <w:rPr>
-          <w:rFonts w:ascii="Book Antiqua" w:hAnsi="Book Antiqua"/>
-          <w:sz w:val="22"/>
-          <w:szCs w:val="22"/>
-        </w:rPr>
-        <w:t>Principal</w:t>
-      </w:r>
-      <w:r>
-        <w:rPr>
-          <w:rFonts w:ascii="Book Antiqua" w:hAnsi="Book Antiqua"/>
-          <w:sz w:val="22"/>
-          <w:szCs w:val="22"/>
-        </w:rPr>
-        <w:t xml:space="preserve">’s rights or delegate any of the </w:t>
-      </w:r>
-      <w:r>
-        <w:rPr>
-          <w:rFonts w:ascii="Book Antiqua" w:hAnsi="Book Antiqua"/>
-          <w:sz w:val="22"/>
-          <w:szCs w:val="22"/>
-        </w:rPr>
-        <w:t>Principal</w:t>
-      </w:r>
-      <w:r>
-        <w:rPr>
-          <w:rFonts w:ascii="Book Antiqua" w:hAnsi="Book Antiqua"/>
-          <w:sz w:val="22"/>
-          <w:szCs w:val="22"/>
-        </w:rPr>
-        <w:t>’s duties or responsibilities under this Agreement</w:t>
-      </w:r>
-      <w:r>
-        <w:rPr>
-          <w:rFonts w:ascii="Book Antiqua" w:hAnsi="Book Antiqua"/>
-          <w:sz w:val="22"/>
-          <w:szCs w:val="22"/>
-        </w:rPr>
-        <w:t xml:space="preserve"> </w:t>
-      </w:r>
-      <w:r>
-        <w:rPr>
-          <w:rFonts w:ascii="Book Antiqua" w:hAnsi="Book Antiqua"/>
-          <w:sz w:val="22"/>
-          <w:szCs w:val="22"/>
-        </w:rPr>
-        <w:t xml:space="preserve">without </w:t>
-      </w:r>
-      <w:r>
-        <w:rPr>
-          <w:rFonts w:ascii="Book Antiqua" w:hAnsi="Book Antiqua"/>
-          <w:sz w:val="22"/>
-          <w:szCs w:val="22"/>
-        </w:rPr>
-        <w:t>Corporation</w:t>
-      </w:r>
-      <w:r>
-        <w:rPr>
-          <w:rFonts w:ascii="Book Antiqua" w:hAnsi="Book Antiqua"/>
-          <w:sz w:val="22"/>
-          <w:szCs w:val="22"/>
-        </w:rPr>
-        <w:t xml:space="preserve">’s prior written consent. </w:t>
-      </w:r>
-      <w:r>
-        <w:rPr>
-          <w:rFonts w:ascii="Book Antiqua" w:hAnsi="Book Antiqua"/>
-          <w:sz w:val="22"/>
-          <w:szCs w:val="22"/>
-        </w:rPr>
-        <w:t>Corporation</w:t>
-      </w:r>
-      <w:r>
-        <w:rPr>
-          <w:rFonts w:ascii="Book Antiqua" w:hAnsi="Book Antiqua"/>
-          <w:sz w:val="22"/>
-          <w:szCs w:val="22"/>
-        </w:rPr>
-        <w:t xml:space="preserve"> may, without the consent of the </w:t>
-      </w:r>
-      <w:r>
-        <w:rPr>
-          <w:rFonts w:ascii="Book Antiqua" w:hAnsi="Book Antiqua"/>
-          <w:sz w:val="22"/>
-          <w:szCs w:val="22"/>
-        </w:rPr>
-        <w:t>Principal</w:t>
-      </w:r>
-      <w:r>
-        <w:rPr>
-          <w:rFonts w:ascii="Book Antiqua" w:hAnsi="Book Antiqua"/>
-          <w:sz w:val="22"/>
-          <w:szCs w:val="22"/>
-        </w:rPr>
-        <w:t xml:space="preserve">, assign its rights, duties and obligations under this Agreement to an affiliate or to a purchaser of all, or substantially all of the assets of </w:t>
-      </w:r>
-      <w:r>
-        <w:rPr>
-          <w:rFonts w:ascii="Book Antiqua" w:hAnsi="Book Antiqua"/>
-          <w:sz w:val="22"/>
-          <w:szCs w:val="22"/>
-        </w:rPr>
-        <w:t>Corporation</w:t>
-      </w:r>
-      <w:r>
-        <w:rPr>
-          <w:rFonts w:ascii="Book Antiqua" w:hAnsi="Book Antiqua"/>
-          <w:sz w:val="22"/>
-          <w:szCs w:val="22"/>
-        </w:rPr>
-        <w:t>.</w:t>
+        <w:t>Each Party will promptly do, sign, deliver or cause to be done, signed and delivered all further acts, documents and things that the other Party may reasonably require for the purpose of giving effect to this Agreement.</w:t>
       </w:r>
     </w:p>
     <w:p>
@@ -3616,7 +3533,23 @@
           <w:sz w:val="22"/>
           <w:szCs w:val="22"/>
         </w:rPr>
-        <w:t>Each Party will promptly do, sign, deliver or cause to be done, signed and delivered all further acts, documents and things that the other Party may reasonably require for the purpose of giving effect to this Agreement.</w:t>
+        <w:t xml:space="preserve">Each of the Parties acknowledges that it has read and understands the terms and conditions contained in this Agreement, and that each of the Parties has provided the other </w:t>
+      </w:r>
+      <w:r>
+        <w:rPr>
+          <w:rFonts w:ascii="Book Antiqua" w:hAnsi="Book Antiqua"/>
+          <w:sz w:val="22"/>
+          <w:szCs w:val="22"/>
+        </w:rPr>
+        <w:t>P</w:t>
+      </w:r>
+      <w:r>
+        <w:rPr>
+          <w:rFonts w:ascii="Book Antiqua" w:hAnsi="Book Antiqua"/>
+          <w:sz w:val="22"/>
+          <w:szCs w:val="22"/>
+        </w:rPr>
+        <w:t xml:space="preserve">arty a reasonable opportunity to seek independent legal advice prior to executing this Agreement. </w:t>
       </w:r>
     </w:p>
     <w:p>
@@ -3639,23 +3572,7 @@
           <w:sz w:val="22"/>
           <w:szCs w:val="22"/>
         </w:rPr>
-        <w:t xml:space="preserve">Each of the Parties acknowledges that it has read and understands the terms and conditions contained in this Agreement, and that each of the Parties has provided the other </w:t>
-      </w:r>
-      <w:r>
-        <w:rPr>
-          <w:rFonts w:ascii="Book Antiqua" w:hAnsi="Book Antiqua"/>
-          <w:sz w:val="22"/>
-          <w:szCs w:val="22"/>
-        </w:rPr>
-        <w:t>P</w:t>
-      </w:r>
-      <w:r>
-        <w:rPr>
-          <w:rFonts w:ascii="Book Antiqua" w:hAnsi="Book Antiqua"/>
-          <w:sz w:val="22"/>
-          <w:szCs w:val="22"/>
-        </w:rPr>
-        <w:t xml:space="preserve">arty a reasonable opportunity to seek independent legal advice prior to executing this Agreement. </w:t>
+        <w:t>This Agreement may be executed in counterparts and by means of facsimile signature or portable document format (PDF), each of which when so executed and delivered shall be an original, but all such counterparts shall together constitute one and the same instrument.</w:t>
       </w:r>
     </w:p>
     <w:p>
@@ -3670,29 +3587,6 @@
           <w:rFonts w:ascii="Book Antiqua" w:hAnsi="Book Antiqua"/>
           <w:sz w:val="22"/>
           <w:szCs w:val="22"/>
-        </w:rPr>
-      </w:pPr>
-      <w:r>
-        <w:rPr>
-          <w:rFonts w:ascii="Book Antiqua" w:hAnsi="Book Antiqua"/>
-          <w:sz w:val="22"/>
-          <w:szCs w:val="22"/>
-        </w:rPr>
-        <w:t>This Agreement may be executed in counterparts and by means of facsimile signature or portable document format (PDF), each of which when so executed and delivered shall be an original, but all such counterparts shall together constitute one and the same instrument.</w:t>
-      </w:r>
-    </w:p>
-    <w:p>
-      <w:pPr>
-        <w:pStyle w:val="ClosingL4"/>
-        <w:numPr>
-          <w:ilvl w:val="3"/>
-          <w:numId w:val="13"/>
-        </w:numPr>
-        <w:spacing w:line="240" w:lineRule="auto"/>
-        <w:rPr>
-          <w:rFonts w:ascii="Book Antiqua" w:hAnsi="Book Antiqua"/>
-          <w:sz w:val="22"/>
-          <w:szCs w:val="22"/>
           <w:lang w:val="fr-CA"/>
         </w:rPr>
       </w:pPr>
@@ -3714,19 +3608,7 @@
           <w:szCs w:val="22"/>
           <w:lang w:val="fr-CA"/>
         </w:rPr>
-        <w:t xml:space="preserve">Les Parties reconnaissent que la présente convention n’est pas un contrat d’adhésion. Pour plus de certitude, il est entendu que les stipulations essentielles contenues aux présentes n’ont pas été imposées par l’une des Parties ou </w:t>
-      </w:r>
-      <w:r>
-        <w:rPr>
-          <w:rFonts w:ascii="Book Antiqua" w:hAnsi="Book Antiqua" w:cs="Arial"/>
-          <w:bCs/>
-          <w:i/>
-          <w:sz w:val="22"/>
-          <w:szCs w:val="22"/>
-          <w:lang w:val="fr-CA"/>
-        </w:rPr>
-        <w:lastRenderedPageBreak/>
-        <w:t>rédigées par elle, pour son compte ou suivant ses instructions, que les Parties ont eu l’occasion de négocier lesdites stipulations essentielles et de demander l’aide d’un conseiller juridique à cet égard, et que les Parties ont dûment négocié lesdites stipulations essentielles avant la signature de la présente convention. Les Parties ont expressément demandé et souhaitent que la présente convention et tous les documents y afférents soient rédigés en anglais.</w:t>
+        <w:t>Les Parties reconnaissent que la présente convention n’est pas un contrat d’adhésion. Pour plus de certitude, il est entendu que les stipulations essentielles contenues aux présentes n’ont pas été imposées par l’une des Parties ou rédigées par elle, pour son compte ou suivant ses instructions, que les Parties ont eu l’occasion de négocier lesdites stipulations essentielles et de demander l’aide d’un conseiller juridique à cet égard, et que les Parties ont dûment négocié lesdites stipulations essentielles avant la signature de la présente convention. Les Parties ont expressément demandé et souhaitent que la présente convention et tous les documents y afférents soient rédigés en anglais.</w:t>
       </w:r>
     </w:p>
     <w:p>
@@ -4107,16 +3989,7 @@
           <w:sz w:val="22"/>
           <w:szCs w:val="22"/>
         </w:rPr>
-        <w:t xml:space="preserve">the </w:t>
-      </w:r>
-      <w:r>
-        <w:rPr>
-          <w:rFonts w:ascii="Book Antiqua" w:hAnsi="Book Antiqua"/>
-          <w:bCs/>
-          <w:sz w:val="22"/>
-          <w:szCs w:val="22"/>
-        </w:rPr>
-        <w:t>Corporation</w:t>
+        <w:t>the Corporation</w:t>
       </w:r>
       <w:r>
         <w:rPr>
@@ -4173,7 +4046,7 @@
 </file>
 
 <file path=word/endnotes.xml><?xml version="1.0" encoding="utf-8"?>
-<w:endnotes xmlns:wpc="http://schemas.microsoft.com/office/word/2010/wordprocessingCanvas" xmlns:cx="http://schemas.microsoft.com/office/drawing/2014/chartex" xmlns:cx1="http://schemas.microsoft.com/office/drawing/2015/9/8/chartex" xmlns:cx2="http://schemas.microsoft.com/office/drawing/2015/10/21/chartex" xmlns:cx3="http://schemas.microsoft.com/office/drawing/2016/5/9/chartex" xmlns:cx4="http://schemas.microsoft.com/office/drawing/2016/5/10/chartex" xmlns:cx5="http://schemas.microsoft.com/office/drawing/2016/5/11/chartex" xmlns:cx6="http://schemas.microsoft.com/office/drawing/2016/5/12/chartex" xmlns:cx7="http://schemas.microsoft.com/office/drawing/2016/5/13/chartex" xmlns:cx8="http://schemas.microsoft.com/office/drawing/2016/5/14/chartex" xmlns:mc="http://schemas.openxmlformats.org/markup-compatibility/2006" xmlns:aink="http://schemas.microsoft.com/office/drawing/2016/ink" xmlns:am3d="http://schemas.microsoft.com/office/drawing/2017/model3d" xmlns:o="urn:schemas-microsoft-com:office:office" xmlns:oel="http://schemas.microsoft.com/office/2019/extlst" xmlns:r="http://schemas.openxmlformats.org/officeDocument/2006/relationships" xmlns:m="http://schemas.openxmlformats.org/officeDocument/2006/math" xmlns:v="urn:schemas-microsoft-com:vml" xmlns:wp14="http://schemas.microsoft.com/office/word/2010/wordprocessingDrawing" xmlns:wp="http://schemas.openxmlformats.org/drawingml/2006/wordprocessingDrawing" xmlns:w10="urn:schemas-microsoft-com:office:word" xmlns:w="http://schemas.openxmlformats.org/wordprocessingml/2006/main" xmlns:w14="http://schemas.microsoft.com/office/word/2010/wordml" xmlns:w15="http://schemas.microsoft.com/office/word/2012/wordml" xmlns:w16cex="http://schemas.microsoft.com/office/word/2018/wordml/cex" xmlns:w16cid="http://schemas.microsoft.com/office/word/2016/wordml/cid" xmlns:w16="http://schemas.microsoft.com/office/word/2018/wordml" xmlns:w16du="http://schemas.microsoft.com/office/word/2023/wordml/word16du" xmlns:w16sdtdh="http://schemas.microsoft.com/office/word/2020/wordml/sdtdatahash" xmlns:w16sdtfl="http://schemas.microsoft.com/office/word/2024/wordml/sdtformatlock" xmlns:w16se="http://schemas.microsoft.com/office/word/2015/wordml/symex" xmlns:wpg="http://schemas.microsoft.com/office/word/2010/wordprocessingGroup" xmlns:wpi="http://schemas.microsoft.com/office/word/2010/wordprocessingInk" xmlns:wne="http://schemas.microsoft.com/office/word/2006/wordml" xmlns:wps="http://schemas.microsoft.com/office/word/2010/wordprocessingShape" mc:Ignorable="w14 w15 w16se w16cid w16 w16cex w16sdtdh w16sdtfl w16du wp14">
+<w:endnotes xmlns:wpc="http://schemas.microsoft.com/office/word/2010/wordprocessingCanvas" xmlns:cx="http://schemas.microsoft.com/office/drawing/2014/chartex" xmlns:cx1="http://schemas.microsoft.com/office/drawing/2015/9/8/chartex" xmlns:cx2="http://schemas.microsoft.com/office/drawing/2015/10/21/chartex" xmlns:cx3="http://schemas.microsoft.com/office/drawing/2016/5/9/chartex" xmlns:cx4="http://schemas.microsoft.com/office/drawing/2016/5/10/chartex" xmlns:cx5="http://schemas.microsoft.com/office/drawing/2016/5/11/chartex" xmlns:cx6="http://schemas.microsoft.com/office/drawing/2016/5/12/chartex" xmlns:cx7="http://schemas.microsoft.com/office/drawing/2016/5/13/chartex" xmlns:cx8="http://schemas.microsoft.com/office/drawing/2016/5/14/chartex" xmlns:mc="http://schemas.openxmlformats.org/markup-compatibility/2006" xmlns:aink="http://schemas.microsoft.com/office/drawing/2016/ink" xmlns:am3d="http://schemas.microsoft.com/office/drawing/2017/model3d" xmlns:o="urn:schemas-microsoft-com:office:office" xmlns:oel="http://schemas.microsoft.com/office/2019/extlst" xmlns:r="http://schemas.openxmlformats.org/officeDocument/2006/relationships" xmlns:m="http://schemas.openxmlformats.org/officeDocument/2006/math" xmlns:v="urn:schemas-microsoft-com:vml" xmlns:wp14="http://schemas.microsoft.com/office/word/2010/wordprocessingDrawing" xmlns:wp="http://schemas.openxmlformats.org/drawingml/2006/wordprocessingDrawing" xmlns:w10="urn:schemas-microsoft-com:office:word" xmlns:w="http://schemas.openxmlformats.org/wordprocessingml/2006/main" xmlns:w14="http://schemas.microsoft.com/office/word/2010/wordml" xmlns:w15="http://schemas.microsoft.com/office/word/2012/wordml" xmlns:w16cei="http://schemas.microsoft.com/office/word/2026/wordml/cei" xmlns:w16cex="http://schemas.microsoft.com/office/word/2018/wordml/cex" xmlns:w16cid="http://schemas.microsoft.com/office/word/2016/wordml/cid" xmlns:w16="http://schemas.microsoft.com/office/word/2018/wordml" xmlns:w16du="http://schemas.microsoft.com/office/word/2023/wordml/word16du" xmlns:w16sdtdh="http://schemas.microsoft.com/office/word/2020/wordml/sdtdatahash" xmlns:w16sdtfl="http://schemas.microsoft.com/office/word/2024/wordml/sdtformatlock" xmlns:w16se="http://schemas.microsoft.com/office/word/2015/wordml/symex" xmlns:wpg="http://schemas.microsoft.com/office/word/2010/wordprocessingGroup" xmlns:wpi="http://schemas.microsoft.com/office/word/2010/wordprocessingInk" xmlns:wne="http://schemas.microsoft.com/office/word/2006/wordml" xmlns:wps="http://schemas.microsoft.com/office/word/2010/wordprocessingShape" mc:Ignorable="w14 w15 w16se w16cid w16 w16cex w16sdtdh w16sdtfl w16du wp14">
   <w:endnote w:type="separator" w:id="-1">
     <w:p>
       <w:r>
@@ -4195,7 +4068,7 @@
 </file>
 
 <file path=word/footer1.xml><?xml version="1.0" encoding="utf-8"?>
-<w:ftr xmlns:wpc="http://schemas.microsoft.com/office/word/2010/wordprocessingCanvas" xmlns:cx="http://schemas.microsoft.com/office/drawing/2014/chartex" xmlns:cx1="http://schemas.microsoft.com/office/drawing/2015/9/8/chartex" xmlns:cx2="http://schemas.microsoft.com/office/drawing/2015/10/21/chartex" xmlns:cx3="http://schemas.microsoft.com/office/drawing/2016/5/9/chartex" xmlns:cx4="http://schemas.microsoft.com/office/drawing/2016/5/10/chartex" xmlns:cx5="http://schemas.microsoft.com/office/drawing/2016/5/11/chartex" xmlns:cx6="http://schemas.microsoft.com/office/drawing/2016/5/12/chartex" xmlns:cx7="http://schemas.microsoft.com/office/drawing/2016/5/13/chartex" xmlns:cx8="http://schemas.microsoft.com/office/drawing/2016/5/14/chartex" xmlns:mc="http://schemas.openxmlformats.org/markup-compatibility/2006" xmlns:aink="http://schemas.microsoft.com/office/drawing/2016/ink" xmlns:am3d="http://schemas.microsoft.com/office/drawing/2017/model3d" xmlns:o="urn:schemas-microsoft-com:office:office" xmlns:oel="http://schemas.microsoft.com/office/2019/extlst" xmlns:r="http://schemas.openxmlformats.org/officeDocument/2006/relationships" xmlns:m="http://schemas.openxmlformats.org/officeDocument/2006/math" xmlns:v="urn:schemas-microsoft-com:vml" xmlns:wp14="http://schemas.microsoft.com/office/word/2010/wordprocessingDrawing" xmlns:wp="http://schemas.openxmlformats.org/drawingml/2006/wordprocessingDrawing" xmlns:w10="urn:schemas-microsoft-com:office:word" xmlns:w="http://schemas.openxmlformats.org/wordprocessingml/2006/main" xmlns:w14="http://schemas.microsoft.com/office/word/2010/wordml" xmlns:w15="http://schemas.microsoft.com/office/word/2012/wordml" xmlns:w16cex="http://schemas.microsoft.com/office/word/2018/wordml/cex" xmlns:w16cid="http://schemas.microsoft.com/office/word/2016/wordml/cid" xmlns:w16="http://schemas.microsoft.com/office/word/2018/wordml" xmlns:w16du="http://schemas.microsoft.com/office/word/2023/wordml/word16du" xmlns:w16sdtdh="http://schemas.microsoft.com/office/word/2020/wordml/sdtdatahash" xmlns:w16sdtfl="http://schemas.microsoft.com/office/word/2024/wordml/sdtformatlock" xmlns:w16se="http://schemas.microsoft.com/office/word/2015/wordml/symex" xmlns:wpg="http://schemas.microsoft.com/office/word/2010/wordprocessingGroup" xmlns:wpi="http://schemas.microsoft.com/office/word/2010/wordprocessingInk" xmlns:wne="http://schemas.microsoft.com/office/word/2006/wordml" xmlns:wps="http://schemas.microsoft.com/office/word/2010/wordprocessingShape" mc:Ignorable="w14 w15 w16se w16cid w16 w16cex w16sdtdh w16sdtfl w16du wp14">
+<w:ftr xmlns:wpc="http://schemas.microsoft.com/office/word/2010/wordprocessingCanvas" xmlns:cx="http://schemas.microsoft.com/office/drawing/2014/chartex" xmlns:cx1="http://schemas.microsoft.com/office/drawing/2015/9/8/chartex" xmlns:cx2="http://schemas.microsoft.com/office/drawing/2015/10/21/chartex" xmlns:cx3="http://schemas.microsoft.com/office/drawing/2016/5/9/chartex" xmlns:cx4="http://schemas.microsoft.com/office/drawing/2016/5/10/chartex" xmlns:cx5="http://schemas.microsoft.com/office/drawing/2016/5/11/chartex" xmlns:cx6="http://schemas.microsoft.com/office/drawing/2016/5/12/chartex" xmlns:cx7="http://schemas.microsoft.com/office/drawing/2016/5/13/chartex" xmlns:cx8="http://schemas.microsoft.com/office/drawing/2016/5/14/chartex" xmlns:mc="http://schemas.openxmlformats.org/markup-compatibility/2006" xmlns:aink="http://schemas.microsoft.com/office/drawing/2016/ink" xmlns:am3d="http://schemas.microsoft.com/office/drawing/2017/model3d" xmlns:o="urn:schemas-microsoft-com:office:office" xmlns:oel="http://schemas.microsoft.com/office/2019/extlst" xmlns:r="http://schemas.openxmlformats.org/officeDocument/2006/relationships" xmlns:m="http://schemas.openxmlformats.org/officeDocument/2006/math" xmlns:v="urn:schemas-microsoft-com:vml" xmlns:wp14="http://schemas.microsoft.com/office/word/2010/wordprocessingDrawing" xmlns:wp="http://schemas.openxmlformats.org/drawingml/2006/wordprocessingDrawing" xmlns:w10="urn:schemas-microsoft-com:office:word" xmlns:w="http://schemas.openxmlformats.org/wordprocessingml/2006/main" xmlns:w14="http://schemas.microsoft.com/office/word/2010/wordml" xmlns:w15="http://schemas.microsoft.com/office/word/2012/wordml" xmlns:w16cei="http://schemas.microsoft.com/office/word/2026/wordml/cei" xmlns:w16cex="http://schemas.microsoft.com/office/word/2018/wordml/cex" xmlns:w16cid="http://schemas.microsoft.com/office/word/2016/wordml/cid" xmlns:w16="http://schemas.microsoft.com/office/word/2018/wordml" xmlns:w16du="http://schemas.microsoft.com/office/word/2023/wordml/word16du" xmlns:w16sdtdh="http://schemas.microsoft.com/office/word/2020/wordml/sdtdatahash" xmlns:w16sdtfl="http://schemas.microsoft.com/office/word/2024/wordml/sdtformatlock" xmlns:w16se="http://schemas.microsoft.com/office/word/2015/wordml/symex" xmlns:wpg="http://schemas.microsoft.com/office/word/2010/wordprocessingGroup" xmlns:wpi="http://schemas.microsoft.com/office/word/2010/wordprocessingInk" xmlns:wne="http://schemas.microsoft.com/office/word/2006/wordml" xmlns:wps="http://schemas.microsoft.com/office/word/2010/wordprocessingShape" mc:Ignorable="w14 w15 w16se w16cid w16 w16cex w16sdtdh w16sdtfl w16du wp14">
   <w:p>
     <w:pPr>
       <w:pStyle w:val="Footer"/>
@@ -4205,7 +4078,7 @@
 </file>
 
 <file path=word/footnotes.xml><?xml version="1.0" encoding="utf-8"?>
-<w:footnotes xmlns:wpc="http://schemas.microsoft.com/office/word/2010/wordprocessingCanvas" xmlns:cx="http://schemas.microsoft.com/office/drawing/2014/chartex" xmlns:cx1="http://schemas.microsoft.com/office/drawing/2015/9/8/chartex" xmlns:cx2="http://schemas.microsoft.com/office/drawing/2015/10/21/chartex" xmlns:cx3="http://schemas.microsoft.com/office/drawing/2016/5/9/chartex" xmlns:cx4="http://schemas.microsoft.com/office/drawing/2016/5/10/chartex" xmlns:cx5="http://schemas.microsoft.com/office/drawing/2016/5/11/chartex" xmlns:cx6="http://schemas.microsoft.com/office/drawing/2016/5/12/chartex" xmlns:cx7="http://schemas.microsoft.com/office/drawing/2016/5/13/chartex" xmlns:cx8="http://schemas.microsoft.com/office/drawing/2016/5/14/chartex" xmlns:mc="http://schemas.openxmlformats.org/markup-compatibility/2006" xmlns:aink="http://schemas.microsoft.com/office/drawing/2016/ink" xmlns:am3d="http://schemas.microsoft.com/office/drawing/2017/model3d" xmlns:o="urn:schemas-microsoft-com:office:office" xmlns:oel="http://schemas.microsoft.com/office/2019/extlst" xmlns:r="http://schemas.openxmlformats.org/officeDocument/2006/relationships" xmlns:m="http://schemas.openxmlformats.org/officeDocument/2006/math" xmlns:v="urn:schemas-microsoft-com:vml" xmlns:wp14="http://schemas.microsoft.com/office/word/2010/wordprocessingDrawing" xmlns:wp="http://schemas.openxmlformats.org/drawingml/2006/wordprocessingDrawing" xmlns:w10="urn:schemas-microsoft-com:office:word" xmlns:w="http://schemas.openxmlformats.org/wordprocessingml/2006/main" xmlns:w14="http://schemas.microsoft.com/office/word/2010/wordml" xmlns:w15="http://schemas.microsoft.com/office/word/2012/wordml" xmlns:w16cex="http://schemas.microsoft.com/office/word/2018/wordml/cex" xmlns:w16cid="http://schemas.microsoft.com/office/word/2016/wordml/cid" xmlns:w16="http://schemas.microsoft.com/office/word/2018/wordml" xmlns:w16du="http://schemas.microsoft.com/office/word/2023/wordml/word16du" xmlns:w16sdtdh="http://schemas.microsoft.com/office/word/2020/wordml/sdtdatahash" xmlns:w16sdtfl="http://schemas.microsoft.com/office/word/2024/wordml/sdtformatlock" xmlns:w16se="http://schemas.microsoft.com/office/word/2015/wordml/symex" xmlns:wpg="http://schemas.microsoft.com/office/word/2010/wordprocessingGroup" xmlns:wpi="http://schemas.microsoft.com/office/word/2010/wordprocessingInk" xmlns:wne="http://schemas.microsoft.com/office/word/2006/wordml" xmlns:wps="http://schemas.microsoft.com/office/word/2010/wordprocessingShape" mc:Ignorable="w14 w15 w16se w16cid w16 w16cex w16sdtdh w16sdtfl w16du wp14">
+<w:footnotes xmlns:wpc="http://schemas.microsoft.com/office/word/2010/wordprocessingCanvas" xmlns:cx="http://schemas.microsoft.com/office/drawing/2014/chartex" xmlns:cx1="http://schemas.microsoft.com/office/drawing/2015/9/8/chartex" xmlns:cx2="http://schemas.microsoft.com/office/drawing/2015/10/21/chartex" xmlns:cx3="http://schemas.microsoft.com/office/drawing/2016/5/9/chartex" xmlns:cx4="http://schemas.microsoft.com/office/drawing/2016/5/10/chartex" xmlns:cx5="http://schemas.microsoft.com/office/drawing/2016/5/11/chartex" xmlns:cx6="http://schemas.microsoft.com/office/drawing/2016/5/12/chartex" xmlns:cx7="http://schemas.microsoft.com/office/drawing/2016/5/13/chartex" xmlns:cx8="http://schemas.microsoft.com/office/drawing/2016/5/14/chartex" xmlns:mc="http://schemas.openxmlformats.org/markup-compatibility/2006" xmlns:aink="http://schemas.microsoft.com/office/drawing/2016/ink" xmlns:am3d="http://schemas.microsoft.com/office/drawing/2017/model3d" xmlns:o="urn:schemas-microsoft-com:office:office" xmlns:oel="http://schemas.microsoft.com/office/2019/extlst" xmlns:r="http://schemas.openxmlformats.org/officeDocument/2006/relationships" xmlns:m="http://schemas.openxmlformats.org/officeDocument/2006/math" xmlns:v="urn:schemas-microsoft-com:vml" xmlns:wp14="http://schemas.microsoft.com/office/word/2010/wordprocessingDrawing" xmlns:wp="http://schemas.openxmlformats.org/drawingml/2006/wordprocessingDrawing" xmlns:w10="urn:schemas-microsoft-com:office:word" xmlns:w="http://schemas.openxmlformats.org/wordprocessingml/2006/main" xmlns:w14="http://schemas.microsoft.com/office/word/2010/wordml" xmlns:w15="http://schemas.microsoft.com/office/word/2012/wordml" xmlns:w16cei="http://schemas.microsoft.com/office/word/2026/wordml/cei" xmlns:w16cex="http://schemas.microsoft.com/office/word/2018/wordml/cex" xmlns:w16cid="http://schemas.microsoft.com/office/word/2016/wordml/cid" xmlns:w16="http://schemas.microsoft.com/office/word/2018/wordml" xmlns:w16du="http://schemas.microsoft.com/office/word/2023/wordml/word16du" xmlns:w16sdtdh="http://schemas.microsoft.com/office/word/2020/wordml/sdtdatahash" xmlns:w16sdtfl="http://schemas.microsoft.com/office/word/2024/wordml/sdtformatlock" xmlns:w16se="http://schemas.microsoft.com/office/word/2015/wordml/symex" xmlns:wpg="http://schemas.microsoft.com/office/word/2010/wordprocessingGroup" xmlns:wpi="http://schemas.microsoft.com/office/word/2010/wordprocessingInk" xmlns:wne="http://schemas.microsoft.com/office/word/2006/wordml" xmlns:wps="http://schemas.microsoft.com/office/word/2010/wordprocessingShape" mc:Ignorable="w14 w15 w16se w16cid w16 w16cex w16sdtdh w16sdtfl w16du wp14">
   <w:footnote w:type="separator" w:id="-1">
     <w:p>
       <w:r>
@@ -4227,7 +4100,7 @@
 </file>
 
 <file path=word/header1.xml><?xml version="1.0" encoding="utf-8"?>
-<w:hdr xmlns:wpc="http://schemas.microsoft.com/office/word/2010/wordprocessingCanvas" xmlns:cx="http://schemas.microsoft.com/office/drawing/2014/chartex" xmlns:cx1="http://schemas.microsoft.com/office/drawing/2015/9/8/chartex" xmlns:cx2="http://schemas.microsoft.com/office/drawing/2015/10/21/chartex" xmlns:cx3="http://schemas.microsoft.com/office/drawing/2016/5/9/chartex" xmlns:cx4="http://schemas.microsoft.com/office/drawing/2016/5/10/chartex" xmlns:cx5="http://schemas.microsoft.com/office/drawing/2016/5/11/chartex" xmlns:cx6="http://schemas.microsoft.com/office/drawing/2016/5/12/chartex" xmlns:cx7="http://schemas.microsoft.com/office/drawing/2016/5/13/chartex" xmlns:cx8="http://schemas.microsoft.com/office/drawing/2016/5/14/chartex" xmlns:mc="http://schemas.openxmlformats.org/markup-compatibility/2006" xmlns:aink="http://schemas.microsoft.com/office/drawing/2016/ink" xmlns:am3d="http://schemas.microsoft.com/office/drawing/2017/model3d" xmlns:o="urn:schemas-microsoft-com:office:office" xmlns:oel="http://schemas.microsoft.com/office/2019/extlst" xmlns:r="http://schemas.openxmlformats.org/officeDocument/2006/relationships" xmlns:m="http://schemas.openxmlformats.org/officeDocument/2006/math" xmlns:v="urn:schemas-microsoft-com:vml" xmlns:wp14="http://schemas.microsoft.com/office/word/2010/wordprocessingDrawing" xmlns:wp="http://schemas.openxmlformats.org/drawingml/2006/wordprocessingDrawing" xmlns:w10="urn:schemas-microsoft-com:office:word" xmlns:w="http://schemas.openxmlformats.org/wordprocessingml/2006/main" xmlns:w14="http://schemas.microsoft.com/office/word/2010/wordml" xmlns:w15="http://schemas.microsoft.com/office/word/2012/wordml" xmlns:w16cex="http://schemas.microsoft.com/office/word/2018/wordml/cex" xmlns:w16cid="http://schemas.microsoft.com/office/word/2016/wordml/cid" xmlns:w16="http://schemas.microsoft.com/office/word/2018/wordml" xmlns:w16du="http://schemas.microsoft.com/office/word/2023/wordml/word16du" xmlns:w16sdtdh="http://schemas.microsoft.com/office/word/2020/wordml/sdtdatahash" xmlns:w16sdtfl="http://schemas.microsoft.com/office/word/2024/wordml/sdtformatlock" xmlns:w16se="http://schemas.microsoft.com/office/word/2015/wordml/symex" xmlns:wpg="http://schemas.microsoft.com/office/word/2010/wordprocessingGroup" xmlns:wpi="http://schemas.microsoft.com/office/word/2010/wordprocessingInk" xmlns:wne="http://schemas.microsoft.com/office/word/2006/wordml" xmlns:wps="http://schemas.microsoft.com/office/word/2010/wordprocessingShape" mc:Ignorable="w14 w15 w16se w16cid w16 w16cex w16sdtdh w16sdtfl w16du wp14">
+<w:hdr xmlns:wpc="http://schemas.microsoft.com/office/word/2010/wordprocessingCanvas" xmlns:cx="http://schemas.microsoft.com/office/drawing/2014/chartex" xmlns:cx1="http://schemas.microsoft.com/office/drawing/2015/9/8/chartex" xmlns:cx2="http://schemas.microsoft.com/office/drawing/2015/10/21/chartex" xmlns:cx3="http://schemas.microsoft.com/office/drawing/2016/5/9/chartex" xmlns:cx4="http://schemas.microsoft.com/office/drawing/2016/5/10/chartex" xmlns:cx5="http://schemas.microsoft.com/office/drawing/2016/5/11/chartex" xmlns:cx6="http://schemas.microsoft.com/office/drawing/2016/5/12/chartex" xmlns:cx7="http://schemas.microsoft.com/office/drawing/2016/5/13/chartex" xmlns:cx8="http://schemas.microsoft.com/office/drawing/2016/5/14/chartex" xmlns:mc="http://schemas.openxmlformats.org/markup-compatibility/2006" xmlns:aink="http://schemas.microsoft.com/office/drawing/2016/ink" xmlns:am3d="http://schemas.microsoft.com/office/drawing/2017/model3d" xmlns:o="urn:schemas-microsoft-com:office:office" xmlns:oel="http://schemas.microsoft.com/office/2019/extlst" xmlns:r="http://schemas.openxmlformats.org/officeDocument/2006/relationships" xmlns:m="http://schemas.openxmlformats.org/officeDocument/2006/math" xmlns:v="urn:schemas-microsoft-com:vml" xmlns:wp14="http://schemas.microsoft.com/office/word/2010/wordprocessingDrawing" xmlns:wp="http://schemas.openxmlformats.org/drawingml/2006/wordprocessingDrawing" xmlns:w10="urn:schemas-microsoft-com:office:word" xmlns:w="http://schemas.openxmlformats.org/wordprocessingml/2006/main" xmlns:w14="http://schemas.microsoft.com/office/word/2010/wordml" xmlns:w15="http://schemas.microsoft.com/office/word/2012/wordml" xmlns:w16cei="http://schemas.microsoft.com/office/word/2026/wordml/cei" xmlns:w16cex="http://schemas.microsoft.com/office/word/2018/wordml/cex" xmlns:w16cid="http://schemas.microsoft.com/office/word/2016/wordml/cid" xmlns:w16="http://schemas.microsoft.com/office/word/2018/wordml" xmlns:w16du="http://schemas.microsoft.com/office/word/2023/wordml/word16du" xmlns:w16sdtdh="http://schemas.microsoft.com/office/word/2020/wordml/sdtdatahash" xmlns:w16sdtfl="http://schemas.microsoft.com/office/word/2024/wordml/sdtformatlock" xmlns:w16se="http://schemas.microsoft.com/office/word/2015/wordml/symex" xmlns:wpg="http://schemas.microsoft.com/office/word/2010/wordprocessingGroup" xmlns:wpi="http://schemas.microsoft.com/office/word/2010/wordprocessingInk" xmlns:wne="http://schemas.microsoft.com/office/word/2006/wordml" xmlns:wps="http://schemas.microsoft.com/office/word/2010/wordprocessingShape" mc:Ignorable="w14 w15 w16se w16cid w16 w16cex w16sdtdh w16sdtfl w16du wp14">
   <w:p>
     <w:pPr>
       <w:pStyle w:val="Header"/>
@@ -4238,7 +4111,7 @@
 </file>
 
 <file path=word/numbering.xml><?xml version="1.0" encoding="utf-8"?>
-<w:numbering xmlns:wpc="http://schemas.microsoft.com/office/word/2010/wordprocessingCanvas" xmlns:cx="http://schemas.microsoft.com/office/drawing/2014/chartex" xmlns:cx1="http://schemas.microsoft.com/office/drawing/2015/9/8/chartex" xmlns:cx2="http://schemas.microsoft.com/office/drawing/2015/10/21/chartex" xmlns:cx3="http://schemas.microsoft.com/office/drawing/2016/5/9/chartex" xmlns:cx4="http://schemas.microsoft.com/office/drawing/2016/5/10/chartex" xmlns:cx5="http://schemas.microsoft.com/office/drawing/2016/5/11/chartex" xmlns:cx6="http://schemas.microsoft.com/office/drawing/2016/5/12/chartex" xmlns:cx7="http://schemas.microsoft.com/office/drawing/2016/5/13/chartex" xmlns:cx8="http://schemas.microsoft.com/office/drawing/2016/5/14/chartex" xmlns:mc="http://schemas.openxmlformats.org/markup-compatibility/2006" xmlns:aink="http://schemas.microsoft.com/office/drawing/2016/ink" xmlns:am3d="http://schemas.microsoft.com/office/drawing/2017/model3d" xmlns:o="urn:schemas-microsoft-com:office:office" xmlns:oel="http://schemas.microsoft.com/office/2019/extlst" xmlns:r="http://schemas.openxmlformats.org/officeDocument/2006/relationships" xmlns:m="http://schemas.openxmlformats.org/officeDocument/2006/math" xmlns:v="urn:schemas-microsoft-com:vml" xmlns:wp14="http://schemas.microsoft.com/office/word/2010/wordprocessingDrawing" xmlns:wp="http://schemas.openxmlformats.org/drawingml/2006/wordprocessingDrawing" xmlns:w10="urn:schemas-microsoft-com:office:word" xmlns:w="http://schemas.openxmlformats.org/wordprocessingml/2006/main" xmlns:w14="http://schemas.microsoft.com/office/word/2010/wordml" xmlns:w15="http://schemas.microsoft.com/office/word/2012/wordml" xmlns:w16cex="http://schemas.microsoft.com/office/word/2018/wordml/cex" xmlns:w16cid="http://schemas.microsoft.com/office/word/2016/wordml/cid" xmlns:w16="http://schemas.microsoft.com/office/word/2018/wordml" xmlns:w16du="http://schemas.microsoft.com/office/word/2023/wordml/word16du" xmlns:w16sdtdh="http://schemas.microsoft.com/office/word/2020/wordml/sdtdatahash" xmlns:w16sdtfl="http://schemas.microsoft.com/office/word/2024/wordml/sdtformatlock" xmlns:w16se="http://schemas.microsoft.com/office/word/2015/wordml/symex" xmlns:wpg="http://schemas.microsoft.com/office/word/2010/wordprocessingGroup" xmlns:wpi="http://schemas.microsoft.com/office/word/2010/wordprocessingInk" xmlns:wne="http://schemas.microsoft.com/office/word/2006/wordml" xmlns:wps="http://schemas.microsoft.com/office/word/2010/wordprocessingShape" mc:Ignorable="w14 w15 w16se w16cid w16 w16cex w16sdtdh w16sdtfl w16du wp14">
+<w:numbering xmlns:wpc="http://schemas.microsoft.com/office/word/2010/wordprocessingCanvas" xmlns:cx="http://schemas.microsoft.com/office/drawing/2014/chartex" xmlns:cx1="http://schemas.microsoft.com/office/drawing/2015/9/8/chartex" xmlns:cx2="http://schemas.microsoft.com/office/drawing/2015/10/21/chartex" xmlns:cx3="http://schemas.microsoft.com/office/drawing/2016/5/9/chartex" xmlns:cx4="http://schemas.microsoft.com/office/drawing/2016/5/10/chartex" xmlns:cx5="http://schemas.microsoft.com/office/drawing/2016/5/11/chartex" xmlns:cx6="http://schemas.microsoft.com/office/drawing/2016/5/12/chartex" xmlns:cx7="http://schemas.microsoft.com/office/drawing/2016/5/13/chartex" xmlns:cx8="http://schemas.microsoft.com/office/drawing/2016/5/14/chartex" xmlns:mc="http://schemas.openxmlformats.org/markup-compatibility/2006" xmlns:aink="http://schemas.microsoft.com/office/drawing/2016/ink" xmlns:am3d="http://schemas.microsoft.com/office/drawing/2017/model3d" xmlns:o="urn:schemas-microsoft-com:office:office" xmlns:oel="http://schemas.microsoft.com/office/2019/extlst" xmlns:r="http://schemas.openxmlformats.org/officeDocument/2006/relationships" xmlns:m="http://schemas.openxmlformats.org/officeDocument/2006/math" xmlns:v="urn:schemas-microsoft-com:vml" xmlns:wp14="http://schemas.microsoft.com/office/word/2010/wordprocessingDrawing" xmlns:wp="http://schemas.openxmlformats.org/drawingml/2006/wordprocessingDrawing" xmlns:w10="urn:schemas-microsoft-com:office:word" xmlns:w="http://schemas.openxmlformats.org/wordprocessingml/2006/main" xmlns:w14="http://schemas.microsoft.com/office/word/2010/wordml" xmlns:w15="http://schemas.microsoft.com/office/word/2012/wordml" xmlns:w16cei="http://schemas.microsoft.com/office/word/2026/wordml/cei" xmlns:w16cex="http://schemas.microsoft.com/office/word/2018/wordml/cex" xmlns:w16cid="http://schemas.microsoft.com/office/word/2016/wordml/cid" xmlns:w16="http://schemas.microsoft.com/office/word/2018/wordml" xmlns:w16du="http://schemas.microsoft.com/office/word/2023/wordml/word16du" xmlns:w16sdtdh="http://schemas.microsoft.com/office/word/2020/wordml/sdtdatahash" xmlns:w16sdtfl="http://schemas.microsoft.com/office/word/2024/wordml/sdtformatlock" xmlns:w16se="http://schemas.microsoft.com/office/word/2015/wordml/symex" xmlns:wpg="http://schemas.microsoft.com/office/word/2010/wordprocessingGroup" xmlns:wpi="http://schemas.microsoft.com/office/word/2010/wordprocessingInk" xmlns:wne="http://schemas.microsoft.com/office/word/2006/wordml" xmlns:wps="http://schemas.microsoft.com/office/word/2010/wordprocessingShape" mc:Ignorable="w14 w15 w16se w16cid w16 w16cex w16sdtdh w16sdtfl w16du wp14">
   <w:abstractNum w:abstractNumId="0" w15:restartNumberingAfterBreak="0">
     <w:nsid w:val="0EA5079D"/>
     <w:multiLevelType w:val="hybridMultilevel"/>

</xml_diff>